<commit_message>
docs: corrige avance parcial Marketplace v1.3
</commit_message>
<xml_diff>
--- a/Fase 2/Evidencias Grupales/Ficha_Avance_03_HurryUp_v1.3_Marketplace_GRUPO06.docx
+++ b/Fase 2/Evidencias Grupales/Ficha_Avance_03_HurryUp_v1.3_Marketplace_GRUPO06.docx
@@ -96,7 +96,7 @@
                 <w:color w:val="000000"/>
                 <w:sz w:val="18"/>
               </w:rPr>
-              <w:t>Vicente Heredia / Vicente Bustos</w:t>
+              <w:t>Vicente Bustos / Vicente Heredia</w:t>
             </w:r>
           </w:p>
         </w:tc>
@@ -279,7 +279,7 @@
                 <w:rFonts w:ascii="Aptos" w:hAnsi="Aptos"/>
                 <w:b w:val="0"/>
                 <w:color w:val="000000"/>
-                <w:sz w:val="17"/>
+                <w:sz w:val="16"/>
               </w:rPr>
               <w:t>Iteración 03 · v1.3 · Marketplace</w:t>
             </w:r>
@@ -344,7 +344,7 @@
                 <w:color w:val="000000"/>
                 <w:sz w:val="18"/>
               </w:rPr>
-              <w:t>24/09/2026</w:t>
+              <w:t>30/09/2026</w:t>
             </w:r>
           </w:p>
         </w:tc>
@@ -482,9 +482,9 @@
           <w:rFonts w:ascii="Aptos" w:hAnsi="Aptos"/>
           <w:b w:val="0"/>
           <w:color w:val="000000"/>
-          <w:sz w:val="21"/>
+          <w:sz w:val="16"/>
         </w:rPr>
-        <w:t>Marketplace público de HurryUp: listado de negocios adheridos y sus publicaciones, con datos de contacto y acceso a su perfil.</w:t>
+        <w:t>Marketplace en desarrollo: sección en la landing llamada “Negocios que trabajan con nosotros”, con un listado de negocios que tienen cuenta en HurryUp y acceso al portafolio de cada negocio.</w:t>
       </w:r>
     </w:p>
     <w:p>
@@ -510,9 +510,9 @@
           <w:rFonts w:ascii="Aptos" w:hAnsi="Aptos"/>
           <w:b w:val="0"/>
           <w:color w:val="000000"/>
-          <w:sz w:val="21"/>
+          <w:sz w:val="16"/>
         </w:rPr>
-        <w:t>Cliente que busca un servicio. Podrá comparar negocios y seleccionar cuál visitar o contactar.</w:t>
+        <w:t>Clientes que buscan un servicio podrán conocer los negocios adheridos y ver ejemplos de sus trabajos antes de elegir. Cada negocio podrá mostrar fotografías de sus trabajos en su portafolio.</w:t>
       </w:r>
     </w:p>
     <w:p>
@@ -538,9 +538,9 @@
           <w:rFonts w:ascii="Aptos" w:hAnsi="Aptos"/>
           <w:b w:val="0"/>
           <w:color w:val="000000"/>
-          <w:sz w:val="21"/>
+          <w:sz w:val="16"/>
         </w:rPr>
-        <w:t>Reservas, clientes, profesionales, servicios y sucursales; gestión de publicaciones por negocio; listado público del Marketplace.</w:t>
+        <w:t>Reserva de horas v1.0 ya disponible; para v1.3 se demostrará el avance de la sección pública de negocios y el recorrido hacia los portafolios. La carga y visualización de fotos se registrará según lo que efectivamente funcione en la demostración.</w:t>
       </w:r>
     </w:p>
     <w:p>
@@ -569,9 +569,9 @@
           <w:rFonts w:ascii="Aptos" w:hAnsi="Aptos"/>
           <w:b w:val="0"/>
           <w:color w:val="000000"/>
-          <w:sz w:val="21"/>
+          <w:sz w:val="16"/>
         </w:rPr>
-        <w:t>La aplicación deberá transformar los datos almacenados o procesados en una salida comprensible para el usuario. La salida puede corresponder a una consulta, listado, reporte, resumen, indicador, alerta, comprobante, gráfico o archivo exportado, según la naturaleza del proyecto. Además, el equipo deberá identificar y demostrar las funcionalidades ya abarcadas en las iteraciones 01, 02 y 03.</w:t>
+        <w:t>El incremento de esta iteración es una salida pública del Marketplace. El equipo presentará el avance de la landing; el estado de listado, perfiles y fotografías se verificará en la demostración y no se declara completo sin comprobar el flujo.</w:t>
       </w:r>
     </w:p>
     <w:tbl>
@@ -722,7 +722,7 @@
                 <w:rFonts w:ascii="Aptos" w:hAnsi="Aptos"/>
                 <w:b w:val="0"/>
                 <w:color w:val="000000"/>
-                <w:sz w:val="18"/>
+                <w:sz w:val="16"/>
               </w:rPr>
               <w:t>Datos</w:t>
             </w:r>
@@ -756,9 +756,9 @@
                 <w:rFonts w:ascii="Aptos" w:hAnsi="Aptos"/>
                 <w:b w:val="0"/>
                 <w:color w:val="000000"/>
-                <w:sz w:val="18"/>
+                <w:sz w:val="16"/>
               </w:rPr>
-              <w:t>La aplicación recupera los datos necesarios desde la base de datos.</w:t>
+              <w:t>Negocios que tienen cuenta en HurryUp y fotografías que sus negocios incorporan.</w:t>
             </w:r>
           </w:p>
         </w:tc>
@@ -792,7 +792,7 @@
                 <w:color w:val="000000"/>
                 <w:sz w:val="16"/>
               </w:rPr>
-              <w:t>Business, MarketplacePost, servicios y datos de contacto de negocios activos.</w:t>
+              <w:t>Confirmar en la demo qué negocios y fotos aparecen realmente.</w:t>
             </w:r>
           </w:p>
         </w:tc>
@@ -827,7 +827,7 @@
                 <w:rFonts w:ascii="Aptos" w:hAnsi="Aptos"/>
                 <w:b w:val="0"/>
                 <w:color w:val="000000"/>
-                <w:sz w:val="18"/>
+                <w:sz w:val="16"/>
               </w:rPr>
               <w:t>Proceso</w:t>
             </w:r>
@@ -862,9 +862,9 @@
                 <w:rFonts w:ascii="Aptos" w:hAnsi="Aptos"/>
                 <w:b w:val="0"/>
                 <w:color w:val="000000"/>
-                <w:sz w:val="18"/>
+                <w:sz w:val="16"/>
               </w:rPr>
-              <w:t>El sistema aplica filtros, cálculos, reglas o agrupaciones.</w:t>
+              <w:t>Mostrar el listado de negocios y asociar el portafolio al negocio seleccionado.</w:t>
             </w:r>
           </w:p>
         </w:tc>
@@ -899,7 +899,7 @@
                 <w:color w:val="000000"/>
                 <w:sz w:val="16"/>
               </w:rPr>
-              <w:t>Consulta publicaciones y datos del negocio; valida la asociación y lista registros activos.</w:t>
+              <w:t>Verificar la asociación y la carga de fotos durante la demo.</w:t>
             </w:r>
           </w:p>
         </w:tc>
@@ -933,7 +933,7 @@
                 <w:rFonts w:ascii="Aptos" w:hAnsi="Aptos"/>
                 <w:b w:val="0"/>
                 <w:color w:val="000000"/>
-                <w:sz w:val="18"/>
+                <w:sz w:val="16"/>
               </w:rPr>
               <w:t>Salida</w:t>
             </w:r>
@@ -967,9 +967,9 @@
                 <w:rFonts w:ascii="Aptos" w:hAnsi="Aptos"/>
                 <w:b w:val="0"/>
                 <w:color w:val="000000"/>
-                <w:sz w:val="18"/>
+                <w:sz w:val="16"/>
               </w:rPr>
-              <w:t>La información se presenta de manera clara y útil.</w:t>
+              <w:t>Sección de landing “Negocios que trabajan con nosotros” y portafolio visual por negocio.</w:t>
             </w:r>
           </w:p>
         </w:tc>
@@ -1003,7 +1003,7 @@
                 <w:color w:val="000000"/>
                 <w:sz w:val="16"/>
               </w:rPr>
-              <w:t>Marketplace público en formato de tarjetas con negocio, imagen, descripción y acceso al perfil.</w:t>
+              <w:t>Avance para presentar el 01/10; registrar evidencia observada.</w:t>
             </w:r>
           </w:p>
         </w:tc>
@@ -1038,7 +1038,7 @@
                 <w:rFonts w:ascii="Aptos" w:hAnsi="Aptos"/>
                 <w:b w:val="0"/>
                 <w:color w:val="000000"/>
-                <w:sz w:val="18"/>
+                <w:sz w:val="16"/>
               </w:rPr>
               <w:t>Comprobación</w:t>
             </w:r>
@@ -1073,9 +1073,9 @@
                 <w:rFonts w:ascii="Aptos" w:hAnsi="Aptos"/>
                 <w:b w:val="0"/>
                 <w:color w:val="000000"/>
-                <w:sz w:val="18"/>
+                <w:sz w:val="16"/>
               </w:rPr>
-              <w:t>El resultado se contrasta con los datos de origen.</w:t>
+              <w:t>Contrastar el negocio seleccionado con las fotos mostradas en su portafolio.</w:t>
             </w:r>
           </w:p>
         </w:tc>
@@ -1110,7 +1110,7 @@
                 <w:color w:val="000000"/>
                 <w:sz w:val="16"/>
               </w:rPr>
-              <w:t>Comparar cada tarjeta con su registro Business/MarketplacePost y la respuesta del endpoint.</w:t>
+              <w:t>Prueba pendiente de observación y registro en la presentación.</w:t>
             </w:r>
           </w:p>
         </w:tc>
@@ -1317,9 +1317,9 @@
                 <w:rFonts w:ascii="Aptos" w:hAnsi="Aptos"/>
                 <w:b w:val="0"/>
                 <w:color w:val="000000"/>
-                <w:sz w:val="18"/>
+                <w:sz w:val="15"/>
               </w:rPr>
-              <w:t>Diseño y flujo principal de la solución</w:t>
+              <w:t>Diseño del flujo del Marketplace</w:t>
             </w:r>
           </w:p>
         </w:tc>
@@ -1351,9 +1351,9 @@
                 <w:rFonts w:ascii="Aptos" w:hAnsi="Aptos"/>
                 <w:b w:val="0"/>
                 <w:color w:val="000000"/>
-                <w:sz w:val="18"/>
+                <w:sz w:val="15"/>
               </w:rPr>
-              <w:t>01</w:t>
+              <w:t>03</w:t>
             </w:r>
           </w:p>
         </w:tc>
@@ -1385,7 +1385,7 @@
                 <w:rFonts w:ascii="Aptos" w:hAnsi="Aptos"/>
                 <w:b w:val="0"/>
                 <w:color w:val="000000"/>
-                <w:sz w:val="16"/>
+                <w:sz w:val="15"/>
               </w:rPr>
               <w:t>☒ Lograda  ☐ Parcial  ☐ Pendiente</w:t>
             </w:r>
@@ -1419,9 +1419,9 @@
                 <w:rFonts w:ascii="Aptos" w:hAnsi="Aptos"/>
                 <w:b w:val="0"/>
                 <w:color w:val="000000"/>
-                <w:sz w:val="16"/>
+                <w:sz w:val="15"/>
               </w:rPr>
-              <w:t>Fase 1: alcance, flujo y diseño del módulo Marketplace.</w:t>
+              <w:t>Alcance informado por el equipo: landing, negocios adheridos y portafolio de fotos.</w:t>
             </w:r>
           </w:p>
         </w:tc>
@@ -1456,9 +1456,9 @@
                 <w:rFonts w:ascii="Aptos" w:hAnsi="Aptos"/>
                 <w:b w:val="0"/>
                 <w:color w:val="000000"/>
-                <w:sz w:val="18"/>
+                <w:sz w:val="15"/>
               </w:rPr>
-              <w:t>Modelo y conexión con la base de datos</w:t>
+              <w:t>Listado público de negocios</w:t>
             </w:r>
           </w:p>
         </w:tc>
@@ -1491,9 +1491,9 @@
                 <w:rFonts w:ascii="Aptos" w:hAnsi="Aptos"/>
                 <w:b w:val="0"/>
                 <w:color w:val="000000"/>
-                <w:sz w:val="18"/>
+                <w:sz w:val="15"/>
               </w:rPr>
-              <w:t>01 y 02</w:t>
+              <w:t>03</w:t>
             </w:r>
           </w:p>
         </w:tc>
@@ -1526,9 +1526,9 @@
                 <w:rFonts w:ascii="Aptos" w:hAnsi="Aptos"/>
                 <w:b w:val="0"/>
                 <w:color w:val="000000"/>
-                <w:sz w:val="16"/>
+                <w:sz w:val="15"/>
               </w:rPr>
-              <w:t>☒ Lograda  ☐ Parcial  ☐ Pendiente</w:t>
+              <w:t>☐ Lograda  ☒ Parcial  ☐ Pendiente</w:t>
             </w:r>
           </w:p>
         </w:tc>
@@ -1561,9 +1561,9 @@
                 <w:rFonts w:ascii="Aptos" w:hAnsi="Aptos"/>
                 <w:b w:val="0"/>
                 <w:color w:val="000000"/>
-                <w:sz w:val="16"/>
+                <w:sz w:val="15"/>
               </w:rPr>
-              <w:t>Módulos HurryUp existentes; entidades Business y MarketplacePost.</w:t>
+              <w:t>El equipo indica que mostrará una parte en la landing; verificar el alcance funcional en demo.</w:t>
             </w:r>
           </w:p>
         </w:tc>
@@ -1597,9 +1597,9 @@
                 <w:rFonts w:ascii="Aptos" w:hAnsi="Aptos"/>
                 <w:b w:val="0"/>
                 <w:color w:val="000000"/>
-                <w:sz w:val="18"/>
+                <w:sz w:val="15"/>
               </w:rPr>
-              <w:t>Ingreso y validación de datos</w:t>
+              <w:t>Perfil y portafolio de cada negocio</w:t>
             </w:r>
           </w:p>
         </w:tc>
@@ -1631,9 +1631,9 @@
                 <w:rFonts w:ascii="Aptos" w:hAnsi="Aptos"/>
                 <w:b w:val="0"/>
                 <w:color w:val="000000"/>
-                <w:sz w:val="18"/>
+                <w:sz w:val="15"/>
               </w:rPr>
-              <w:t>02</w:t>
+              <w:t>03</w:t>
             </w:r>
           </w:p>
         </w:tc>
@@ -1665,9 +1665,9 @@
                 <w:rFonts w:ascii="Aptos" w:hAnsi="Aptos"/>
                 <w:b w:val="0"/>
                 <w:color w:val="000000"/>
-                <w:sz w:val="16"/>
+                <w:sz w:val="15"/>
               </w:rPr>
-              <w:t>☒ Lograda  ☐ Parcial  ☐ Pendiente</w:t>
+              <w:t>☐ Lograda  ☒ Parcial  ☐ Pendiente</w:t>
             </w:r>
           </w:p>
         </w:tc>
@@ -1699,9 +1699,9 @@
                 <w:rFonts w:ascii="Aptos" w:hAnsi="Aptos"/>
                 <w:b w:val="0"/>
                 <w:color w:val="000000"/>
-                <w:sz w:val="16"/>
+                <w:sz w:val="15"/>
               </w:rPr>
-              <w:t>Formularios de gestión y publicación asociados al negocio.</w:t>
+              <w:t>Parte del alcance v1.3; falta comprobar navegación y asociación de contenido.</w:t>
             </w:r>
           </w:p>
         </w:tc>
@@ -1736,9 +1736,9 @@
                 <w:rFonts w:ascii="Aptos" w:hAnsi="Aptos"/>
                 <w:b w:val="0"/>
                 <w:color w:val="000000"/>
-                <w:sz w:val="18"/>
+                <w:sz w:val="15"/>
               </w:rPr>
-              <w:t>Proceso funcional sobre los datos</w:t>
+              <w:t>Carga y visualización de fotos</w:t>
             </w:r>
           </w:p>
         </w:tc>
@@ -1771,9 +1771,9 @@
                 <w:rFonts w:ascii="Aptos" w:hAnsi="Aptos"/>
                 <w:b w:val="0"/>
                 <w:color w:val="000000"/>
-                <w:sz w:val="18"/>
+                <w:sz w:val="15"/>
               </w:rPr>
-              <w:t>02</w:t>
+              <w:t>03</w:t>
             </w:r>
           </w:p>
         </w:tc>
@@ -1806,9 +1806,9 @@
                 <w:rFonts w:ascii="Aptos" w:hAnsi="Aptos"/>
                 <w:b w:val="0"/>
                 <w:color w:val="000000"/>
-                <w:sz w:val="16"/>
+                <w:sz w:val="15"/>
               </w:rPr>
-              <w:t>☒ Lograda  ☐ Parcial  ☐ Pendiente</w:t>
+              <w:t>☐ Lograda  ☐ Parcial  ☒ Pendiente</w:t>
             </w:r>
           </w:p>
         </w:tc>
@@ -1841,9 +1841,9 @@
                 <w:rFonts w:ascii="Aptos" w:hAnsi="Aptos"/>
                 <w:b w:val="0"/>
                 <w:color w:val="000000"/>
-                <w:sz w:val="16"/>
+                <w:sz w:val="15"/>
               </w:rPr>
-              <w:t>Consulta e integración de publicaciones con datos del negocio.</w:t>
+              <w:t>Requisito declarado; funcionamiento aún no confirmado.</w:t>
             </w:r>
           </w:p>
         </w:tc>
@@ -1877,9 +1877,9 @@
                 <w:rFonts w:ascii="Aptos" w:hAnsi="Aptos"/>
                 <w:b w:val="0"/>
                 <w:color w:val="000000"/>
-                <w:sz w:val="18"/>
+                <w:sz w:val="15"/>
               </w:rPr>
-              <w:t>Salida de datos para el usuario</w:t>
+              <w:t>Reserva de horas v1.0</w:t>
             </w:r>
           </w:p>
         </w:tc>
@@ -1911,9 +1911,9 @@
                 <w:rFonts w:ascii="Aptos" w:hAnsi="Aptos"/>
                 <w:b w:val="0"/>
                 <w:color w:val="000000"/>
-                <w:sz w:val="18"/>
+                <w:sz w:val="15"/>
               </w:rPr>
-              <w:t>03</w:t>
+              <w:t>02</w:t>
             </w:r>
           </w:p>
         </w:tc>
@@ -1945,7 +1945,7 @@
                 <w:rFonts w:ascii="Aptos" w:hAnsi="Aptos"/>
                 <w:b w:val="0"/>
                 <w:color w:val="000000"/>
-                <w:sz w:val="16"/>
+                <w:sz w:val="15"/>
               </w:rPr>
               <w:t>☒ Lograda  ☐ Parcial  ☐ Pendiente</w:t>
             </w:r>
@@ -1979,9 +1979,9 @@
                 <w:rFonts w:ascii="Aptos" w:hAnsi="Aptos"/>
                 <w:b w:val="0"/>
                 <w:color w:val="000000"/>
-                <w:sz w:val="16"/>
+                <w:sz w:val="15"/>
               </w:rPr>
-              <w:t>Vista pública del Marketplace demostrable en HurryUp.</w:t>
+              <w:t>El equipo informó que el cliente ingresa datos y la reserva aparece en el calendario del profesional.</w:t>
             </w:r>
           </w:p>
         </w:tc>
@@ -2016,9 +2016,9 @@
                 <w:rFonts w:ascii="Aptos" w:hAnsi="Aptos"/>
                 <w:b w:val="0"/>
                 <w:color w:val="000000"/>
-                <w:sz w:val="16"/>
+                <w:sz w:val="15"/>
               </w:rPr>
-              <w:t>Adaptación por rubro y responsive móvil</w:t>
+              <w:t>Adaptación móvil y distinción por rubro</w:t>
             </w:r>
           </w:p>
         </w:tc>
@@ -2051,9 +2051,9 @@
                 <w:rFonts w:ascii="Aptos" w:hAnsi="Aptos"/>
                 <w:b w:val="0"/>
                 <w:color w:val="000000"/>
-                <w:sz w:val="16"/>
+                <w:sz w:val="15"/>
               </w:rPr>
-              <w:t>04</w:t>
+              <w:t>Posterior</w:t>
             </w:r>
           </w:p>
         </w:tc>
@@ -2086,7 +2086,7 @@
                 <w:rFonts w:ascii="Aptos" w:hAnsi="Aptos"/>
                 <w:b w:val="0"/>
                 <w:color w:val="000000"/>
-                <w:sz w:val="16"/>
+                <w:sz w:val="15"/>
               </w:rPr>
               <w:t>☐ Lograda  ☐ Parcial  ☒ Pendiente</w:t>
             </w:r>
@@ -2121,9 +2121,9 @@
                 <w:rFonts w:ascii="Aptos" w:hAnsi="Aptos"/>
                 <w:b w:val="0"/>
                 <w:color w:val="000000"/>
-                <w:sz w:val="16"/>
+                <w:sz w:val="15"/>
               </w:rPr>
-              <w:t>Compromiso de versión 2.0.</w:t>
+              <w:t>Mejoras futuras; no forman parte del incremento Marketplace v1.3.</w:t>
             </w:r>
           </w:p>
         </w:tc>
@@ -2258,9 +2258,9 @@
                 <w:rFonts w:ascii="Aptos" w:hAnsi="Aptos"/>
                 <w:b w:val="0"/>
                 <w:color w:val="000000"/>
-                <w:sz w:val="18"/>
+                <w:sz w:val="16"/>
               </w:rPr>
-              <w:t>Datos de origen y tablas involucradas</w:t>
+              <w:t>Datos de origen</w:t>
             </w:r>
           </w:p>
         </w:tc>
@@ -2294,7 +2294,7 @@
                 <w:color w:val="000000"/>
                 <w:sz w:val="16"/>
               </w:rPr>
-              <w:t>Business, MarketplacePost, Service y datos de contacto de los negocios adheridos.</w:t>
+              <w:t>Negocios con cuenta en HurryUp y fotografías de trabajos asociadas a cada negocio; confirmar los campos disponibles en la implementación.</w:t>
             </w:r>
           </w:p>
         </w:tc>
@@ -2329,9 +2329,9 @@
                 <w:rFonts w:ascii="Aptos" w:hAnsi="Aptos"/>
                 <w:b w:val="0"/>
                 <w:color w:val="000000"/>
-                <w:sz w:val="18"/>
+                <w:sz w:val="16"/>
               </w:rPr>
-              <w:t>Proceso, filtro, cálculo o regla aplicada</w:t>
+              <w:t>Transformación</w:t>
             </w:r>
           </w:p>
         </w:tc>
@@ -2366,7 +2366,7 @@
                 <w:color w:val="000000"/>
                 <w:sz w:val="16"/>
               </w:rPr>
-              <w:t>Consultar registros activos, asociar publicaciones a su negocio y exponerlos en un listado navegable.</w:t>
+              <w:t>Seleccionar los negocios que se mostrarán y relacionar cada portafolio con el negocio correspondiente.</w:t>
             </w:r>
           </w:p>
         </w:tc>
@@ -2400,9 +2400,9 @@
                 <w:rFonts w:ascii="Aptos" w:hAnsi="Aptos"/>
                 <w:b w:val="0"/>
                 <w:color w:val="000000"/>
-                <w:sz w:val="18"/>
+                <w:sz w:val="16"/>
               </w:rPr>
-              <w:t>Formato de salida seleccionado</w:t>
+              <w:t>Salida generada</w:t>
             </w:r>
           </w:p>
         </w:tc>
@@ -2436,7 +2436,7 @@
                 <w:color w:val="000000"/>
                 <w:sz w:val="16"/>
               </w:rPr>
-              <w:t>Vista web pública tipo Marketplace, con tarjetas de negocio y publicaciones visuales.</w:t>
+              <w:t>Listado público en la landing, acceso al negocio y presentación de las fotos de su portafolio.</w:t>
             </w:r>
           </w:p>
         </w:tc>
@@ -2471,9 +2471,9 @@
                 <w:rFonts w:ascii="Aptos" w:hAnsi="Aptos"/>
                 <w:b w:val="0"/>
                 <w:color w:val="000000"/>
-                <w:sz w:val="18"/>
+                <w:sz w:val="16"/>
               </w:rPr>
-              <w:t>Criterio para comprobar que la salida es correcta</w:t>
+              <w:t>Comprobación</w:t>
             </w:r>
           </w:p>
         </w:tc>
@@ -2508,7 +2508,7 @@
                 <w:color w:val="000000"/>
                 <w:sz w:val="16"/>
               </w:rPr>
-              <w:t>La tarjeta debe mostrar el negocio y publicación correctos al contrastarla con los datos de origen.</w:t>
+              <w:t>Elegir un negocio y confirmar que el listado y las fotografías visibles corresponden a ese negocio; documentar el resultado de la demo.</w:t>
             </w:r>
           </w:p>
         </w:tc>
@@ -2787,9 +2787,9 @@
                 <w:rFonts w:ascii="Aptos" w:hAnsi="Aptos"/>
                 <w:b w:val="0"/>
                 <w:color w:val="000000"/>
-                <w:sz w:val="16"/>
+                <w:sz w:val="14"/>
               </w:rPr>
-              <w:t>Completar consulta y asociación de datos del Marketplace</w:t>
+              <w:t>Presentar el avance real de la sección Marketplace</w:t>
             </w:r>
           </w:p>
         </w:tc>
@@ -2821,9 +2821,9 @@
                 <w:rFonts w:ascii="Aptos" w:hAnsi="Aptos"/>
                 <w:b w:val="0"/>
                 <w:color w:val="000000"/>
-                <w:sz w:val="16"/>
+                <w:sz w:val="14"/>
               </w:rPr>
-              <w:t>Vicente Heredia</w:t>
+              <w:t>Equipo</w:t>
             </w:r>
           </w:p>
         </w:tc>
@@ -2855,9 +2855,9 @@
                 <w:rFonts w:ascii="Aptos" w:hAnsi="Aptos"/>
                 <w:b w:val="0"/>
                 <w:color w:val="000000"/>
-                <w:sz w:val="16"/>
+                <w:sz w:val="14"/>
               </w:rPr>
-              <w:t>22/09</w:t>
+              <w:t>01/10</w:t>
             </w:r>
           </w:p>
         </w:tc>
@@ -2889,9 +2889,9 @@
                 <w:rFonts w:ascii="Aptos" w:hAnsi="Aptos"/>
                 <w:b w:val="0"/>
                 <w:color w:val="000000"/>
-                <w:sz w:val="16"/>
+                <w:sz w:val="14"/>
               </w:rPr>
-              <w:t>24/09</w:t>
+              <w:t>01/10</w:t>
             </w:r>
           </w:p>
         </w:tc>
@@ -2923,9 +2923,9 @@
                 <w:rFonts w:ascii="Aptos" w:hAnsi="Aptos"/>
                 <w:b w:val="0"/>
                 <w:color w:val="000000"/>
-                <w:sz w:val="16"/>
+                <w:sz w:val="14"/>
               </w:rPr>
-              <w:t>Completada</w:t>
+              <w:t>Planificada</w:t>
             </w:r>
           </w:p>
         </w:tc>
@@ -2957,9 +2957,9 @@
                 <w:rFonts w:ascii="Aptos" w:hAnsi="Aptos"/>
                 <w:b w:val="0"/>
                 <w:color w:val="000000"/>
-                <w:sz w:val="16"/>
+                <w:sz w:val="14"/>
               </w:rPr>
-              <w:t>Consulta de negocios y publicaciones en rama HurryDuoc.</w:t>
+              <w:t>Registrar qué partes de la landing y del recorrido funcionan.</w:t>
             </w:r>
           </w:p>
         </w:tc>
@@ -2994,9 +2994,9 @@
                 <w:rFonts w:ascii="Aptos" w:hAnsi="Aptos"/>
                 <w:b w:val="0"/>
                 <w:color w:val="000000"/>
-                <w:sz w:val="16"/>
+                <w:sz w:val="14"/>
               </w:rPr>
-              <w:t>Integrar vista pública y tarjetas de negocio</w:t>
+              <w:t>Completar listado y acceso al portafolio por negocio</w:t>
             </w:r>
           </w:p>
         </w:tc>
@@ -3029,9 +3029,9 @@
                 <w:rFonts w:ascii="Aptos" w:hAnsi="Aptos"/>
                 <w:b w:val="0"/>
                 <w:color w:val="000000"/>
-                <w:sz w:val="16"/>
+                <w:sz w:val="14"/>
               </w:rPr>
-              <w:t>Vicente Bustos</w:t>
+              <w:t>Vicente Heredia / Vicente Bustos</w:t>
             </w:r>
           </w:p>
         </w:tc>
@@ -3064,9 +3064,9 @@
                 <w:rFonts w:ascii="Aptos" w:hAnsi="Aptos"/>
                 <w:b w:val="0"/>
                 <w:color w:val="000000"/>
-                <w:sz w:val="16"/>
+                <w:sz w:val="14"/>
               </w:rPr>
-              <w:t>23/09</w:t>
+              <w:t>01/10</w:t>
             </w:r>
           </w:p>
         </w:tc>
@@ -3099,9 +3099,9 @@
                 <w:rFonts w:ascii="Aptos" w:hAnsi="Aptos"/>
                 <w:b w:val="0"/>
                 <w:color w:val="000000"/>
-                <w:sz w:val="16"/>
+                <w:sz w:val="14"/>
               </w:rPr>
-              <w:t>25/09</w:t>
+              <w:t>08/10</w:t>
             </w:r>
           </w:p>
         </w:tc>
@@ -3134,9 +3134,9 @@
                 <w:rFonts w:ascii="Aptos" w:hAnsi="Aptos"/>
                 <w:b w:val="0"/>
                 <w:color w:val="000000"/>
-                <w:sz w:val="16"/>
+                <w:sz w:val="14"/>
               </w:rPr>
-              <w:t>En curso</w:t>
+              <w:t>Pendiente</w:t>
             </w:r>
           </w:p>
         </w:tc>
@@ -3169,9 +3169,9 @@
                 <w:rFonts w:ascii="Aptos" w:hAnsi="Aptos"/>
                 <w:b w:val="0"/>
                 <w:color w:val="000000"/>
-                <w:sz w:val="16"/>
+                <w:sz w:val="14"/>
               </w:rPr>
-              <w:t>Vista Marketplace y navegación desde HurryUp.</w:t>
+              <w:t>Negocio seleccionable con su portafolio asociado.</w:t>
             </w:r>
           </w:p>
         </w:tc>
@@ -3205,9 +3205,9 @@
                 <w:rFonts w:ascii="Aptos" w:hAnsi="Aptos"/>
                 <w:b w:val="0"/>
                 <w:color w:val="000000"/>
-                <w:sz w:val="16"/>
+                <w:sz w:val="14"/>
               </w:rPr>
-              <w:t>Probar flujo y documentar evidencia</w:t>
+              <w:t>Probar carga y visualización de fotos y guardar evidencia</w:t>
             </w:r>
           </w:p>
         </w:tc>
@@ -3239,9 +3239,9 @@
                 <w:rFonts w:ascii="Aptos" w:hAnsi="Aptos"/>
                 <w:b w:val="0"/>
                 <w:color w:val="000000"/>
-                <w:sz w:val="16"/>
+                <w:sz w:val="14"/>
               </w:rPr>
-              <w:t>Equipo</w:t>
+              <w:t>Vicente Heredia / Vicente Bustos</w:t>
             </w:r>
           </w:p>
         </w:tc>
@@ -3273,9 +3273,9 @@
                 <w:rFonts w:ascii="Aptos" w:hAnsi="Aptos"/>
                 <w:b w:val="0"/>
                 <w:color w:val="000000"/>
-                <w:sz w:val="16"/>
+                <w:sz w:val="14"/>
               </w:rPr>
-              <w:t>25/09</w:t>
+              <w:t>08/10</w:t>
             </w:r>
           </w:p>
         </w:tc>
@@ -3307,9 +3307,9 @@
                 <w:rFonts w:ascii="Aptos" w:hAnsi="Aptos"/>
                 <w:b w:val="0"/>
                 <w:color w:val="000000"/>
-                <w:sz w:val="16"/>
+                <w:sz w:val="14"/>
               </w:rPr>
-              <w:t>26/09</w:t>
+              <w:t>10/10</w:t>
             </w:r>
           </w:p>
         </w:tc>
@@ -3341,9 +3341,9 @@
                 <w:rFonts w:ascii="Aptos" w:hAnsi="Aptos"/>
                 <w:b w:val="0"/>
                 <w:color w:val="000000"/>
-                <w:sz w:val="16"/>
+                <w:sz w:val="14"/>
               </w:rPr>
-              <w:t>Planificada</w:t>
+              <w:t>Pendiente</w:t>
             </w:r>
           </w:p>
         </w:tc>
@@ -3375,9 +3375,9 @@
                 <w:rFonts w:ascii="Aptos" w:hAnsi="Aptos"/>
                 <w:b w:val="0"/>
                 <w:color w:val="000000"/>
-                <w:sz w:val="16"/>
+                <w:sz w:val="14"/>
               </w:rPr>
-              <w:t>Capturas y contraste con datos de origen.</w:t>
+              <w:t>Foto incorporada y visible bajo el negocio correcto.</w:t>
             </w:r>
           </w:p>
         </w:tc>
@@ -3562,9 +3562,9 @@
                 <w:rFonts w:ascii="Aptos" w:hAnsi="Aptos"/>
                 <w:b w:val="0"/>
                 <w:color w:val="000000"/>
-                <w:sz w:val="18"/>
+                <w:sz w:val="15"/>
               </w:rPr>
-              <w:t>1  Mostrar los datos de origen</w:t>
+              <w:t>1. Abrir la landing y ubicar “Negocios que trabajan con nosotros”.</w:t>
             </w:r>
           </w:p>
         </w:tc>
@@ -3596,9 +3596,9 @@
                 <w:rFonts w:ascii="Aptos" w:hAnsi="Aptos"/>
                 <w:b w:val="0"/>
                 <w:color w:val="000000"/>
-                <w:sz w:val="16"/>
+                <w:sz w:val="15"/>
               </w:rPr>
-              <w:t>Registros activos de Business y MarketplacePost disponibles para consulta.</w:t>
+              <w:t>Avance que el equipo presentará el 01/10; observación pendiente.</w:t>
             </w:r>
           </w:p>
         </w:tc>
@@ -3630,9 +3630,9 @@
                 <w:rFonts w:ascii="Aptos" w:hAnsi="Aptos"/>
                 <w:b w:val="0"/>
                 <w:color w:val="000000"/>
-                <w:sz w:val="16"/>
+                <w:sz w:val="15"/>
               </w:rPr>
-              <w:t>☒ Logrado  ☐ Parcial  ☐ No logrado</w:t>
+              <w:t>☐ Logrado  ☐ Parcial  ☒ Pendiente</w:t>
             </w:r>
           </w:p>
         </w:tc>
@@ -3667,9 +3667,9 @@
                 <w:rFonts w:ascii="Aptos" w:hAnsi="Aptos"/>
                 <w:b w:val="0"/>
                 <w:color w:val="000000"/>
-                <w:sz w:val="18"/>
+                <w:sz w:val="15"/>
               </w:rPr>
-              <w:t>2  Ejecutar el proceso desde la aplicación</w:t>
+              <w:t>2. Mostrar los negocios que aparecen en el listado.</w:t>
             </w:r>
           </w:p>
         </w:tc>
@@ -3702,9 +3702,9 @@
                 <w:rFonts w:ascii="Aptos" w:hAnsi="Aptos"/>
                 <w:b w:val="0"/>
                 <w:color w:val="000000"/>
-                <w:sz w:val="16"/>
+                <w:sz w:val="15"/>
               </w:rPr>
-              <w:t>La aplicación recupera publicaciones y sus datos de negocio asociados.</w:t>
+              <w:t>Registrar nombres y datos visibles durante la demostración.</w:t>
             </w:r>
           </w:p>
         </w:tc>
@@ -3737,9 +3737,9 @@
                 <w:rFonts w:ascii="Aptos" w:hAnsi="Aptos"/>
                 <w:b w:val="0"/>
                 <w:color w:val="000000"/>
-                <w:sz w:val="16"/>
+                <w:sz w:val="15"/>
               </w:rPr>
-              <w:t>☒ Logrado  ☐ Parcial  ☐ No logrado</w:t>
+              <w:t>☐ Logrado  ☐ Parcial  ☒ Pendiente</w:t>
             </w:r>
           </w:p>
         </w:tc>
@@ -3773,9 +3773,9 @@
                 <w:rFonts w:ascii="Aptos" w:hAnsi="Aptos"/>
                 <w:b w:val="0"/>
                 <w:color w:val="000000"/>
-                <w:sz w:val="18"/>
+                <w:sz w:val="15"/>
               </w:rPr>
-              <w:t>3  Visualizar la salida de datos</w:t>
+              <w:t>3. Abrir un negocio desde el listado.</w:t>
             </w:r>
           </w:p>
         </w:tc>
@@ -3807,9 +3807,9 @@
                 <w:rFonts w:ascii="Aptos" w:hAnsi="Aptos"/>
                 <w:b w:val="0"/>
                 <w:color w:val="000000"/>
-                <w:sz w:val="16"/>
+                <w:sz w:val="15"/>
               </w:rPr>
-              <w:t>Tarjetas visibles con negocio, imagen, descripción y acceso al perfil.</w:t>
+              <w:t>Comprobar si se abre el perfil/portafolio correspondiente.</w:t>
             </w:r>
           </w:p>
         </w:tc>
@@ -3841,9 +3841,9 @@
                 <w:rFonts w:ascii="Aptos" w:hAnsi="Aptos"/>
                 <w:b w:val="0"/>
                 <w:color w:val="000000"/>
-                <w:sz w:val="16"/>
+                <w:sz w:val="15"/>
               </w:rPr>
-              <w:t>☒ Logrado  ☐ Parcial  ☐ No logrado</w:t>
+              <w:t>☐ Logrado  ☐ Parcial  ☒ Pendiente</w:t>
             </w:r>
           </w:p>
         </w:tc>
@@ -3878,9 +3878,9 @@
                 <w:rFonts w:ascii="Aptos" w:hAnsi="Aptos"/>
                 <w:b w:val="0"/>
                 <w:color w:val="000000"/>
-                <w:sz w:val="18"/>
+                <w:sz w:val="15"/>
               </w:rPr>
-              <w:t>4  Comprobar que el resultado es correcto</w:t>
+              <w:t>4. Mostrar fotografías del portafolio.</w:t>
             </w:r>
           </w:p>
         </w:tc>
@@ -3913,9 +3913,9 @@
                 <w:rFonts w:ascii="Aptos" w:hAnsi="Aptos"/>
                 <w:b w:val="0"/>
                 <w:color w:val="000000"/>
-                <w:sz w:val="16"/>
+                <w:sz w:val="15"/>
               </w:rPr>
-              <w:t>Se contrasta identificador, negocio, imagen y descripción con los datos recuperados.</w:t>
+              <w:t>Comprobar si cada foto corresponde al negocio seleccionado.</w:t>
             </w:r>
           </w:p>
         </w:tc>
@@ -3948,9 +3948,9 @@
                 <w:rFonts w:ascii="Aptos" w:hAnsi="Aptos"/>
                 <w:b w:val="0"/>
                 <w:color w:val="000000"/>
-                <w:sz w:val="16"/>
+                <w:sz w:val="15"/>
               </w:rPr>
-              <w:t>☒ Logrado  ☐ Parcial  ☐ No logrado</w:t>
+              <w:t>☐ Logrado  ☐ Parcial  ☒ Pendiente</w:t>
             </w:r>
           </w:p>
         </w:tc>
@@ -3984,9 +3984,9 @@
                 <w:rFonts w:ascii="Aptos" w:hAnsi="Aptos"/>
                 <w:b w:val="0"/>
                 <w:color w:val="000000"/>
-                <w:sz w:val="18"/>
+                <w:sz w:val="15"/>
               </w:rPr>
-              <w:t>5  Demostrar funcionalidades de iteraciones 01 y 02</w:t>
+              <w:t>5. Incorporar o actualizar una fotografía, si la función está disponible.</w:t>
             </w:r>
           </w:p>
         </w:tc>
@@ -4018,9 +4018,9 @@
                 <w:rFonts w:ascii="Aptos" w:hAnsi="Aptos"/>
                 <w:b w:val="0"/>
                 <w:color w:val="000000"/>
-                <w:sz w:val="16"/>
+                <w:sz w:val="15"/>
               </w:rPr>
-              <w:t>Accesos, dashboard, reservas, clientes, servicios y flujo básico del Marketplace.</w:t>
+              <w:t>Verificar que el cambio se refleje en el portafolio público.</w:t>
             </w:r>
           </w:p>
         </w:tc>
@@ -4052,9 +4052,9 @@
                 <w:rFonts w:ascii="Aptos" w:hAnsi="Aptos"/>
                 <w:b w:val="0"/>
                 <w:color w:val="000000"/>
-                <w:sz w:val="16"/>
+                <w:sz w:val="15"/>
               </w:rPr>
-              <w:t>☒ Logrado  ☐ Parcial  ☐ No logrado</w:t>
+              <w:t>☐ Logrado  ☐ Parcial  ☒ Pendiente</w:t>
             </w:r>
           </w:p>
         </w:tc>
@@ -4089,9 +4089,9 @@
                 <w:rFonts w:ascii="Aptos" w:hAnsi="Aptos"/>
                 <w:b w:val="0"/>
                 <w:color w:val="000000"/>
-                <w:sz w:val="18"/>
+                <w:sz w:val="15"/>
               </w:rPr>
-              <w:t>6  Identificar brechas y funcionalidades pendientes</w:t>
+              <w:t>6. Resumir lo funcional y lo que queda pendiente.</w:t>
             </w:r>
           </w:p>
         </w:tc>
@@ -4124,9 +4124,9 @@
                 <w:rFonts w:ascii="Aptos" w:hAnsi="Aptos"/>
                 <w:b w:val="0"/>
                 <w:color w:val="000000"/>
-                <w:sz w:val="16"/>
+                <w:sz w:val="15"/>
               </w:rPr>
-              <w:t>Responsive móvil y terminología específica por rubro se abordan en la versión 2.0.</w:t>
+              <w:t>Completar con evidencia observada en la reunión.</w:t>
             </w:r>
           </w:p>
         </w:tc>
@@ -4159,9 +4159,9 @@
                 <w:rFonts w:ascii="Aptos" w:hAnsi="Aptos"/>
                 <w:b w:val="0"/>
                 <w:color w:val="000000"/>
-                <w:sz w:val="16"/>
+                <w:sz w:val="15"/>
               </w:rPr>
-              <w:t>☒ Logrado  ☐ Parcial  ☐ No logrado</w:t>
+              <w:t>☐ Logrado  ☐ Parcial  ☒ Pendiente</w:t>
             </w:r>
           </w:p>
         </w:tc>
@@ -4332,7 +4332,7 @@
                 <w:rFonts w:ascii="Aptos" w:hAnsi="Aptos"/>
                 <w:b w:val="0"/>
                 <w:color w:val="000000"/>
-                <w:sz w:val="18"/>
+                <w:sz w:val="15"/>
               </w:rPr>
               <w:t>¿La salida responde a una necesidad del usuario?</w:t>
             </w:r>
@@ -4366,9 +4366,9 @@
                 <w:rFonts w:ascii="Aptos" w:hAnsi="Aptos"/>
                 <w:b w:val="0"/>
                 <w:color w:val="000000"/>
-                <w:sz w:val="16"/>
+                <w:sz w:val="15"/>
               </w:rPr>
-              <w:t>Permite descubrir negocios adheridos y elegir cuál contactar o visitar según sus publicaciones.</w:t>
+              <w:t>Sí: permite descubrir negocios adheridos y conocer sus trabajos. Validar la utilidad con el avance mostrado.</w:t>
             </w:r>
           </w:p>
         </w:tc>
@@ -4400,7 +4400,7 @@
                 <w:rFonts w:ascii="Aptos" w:hAnsi="Aptos"/>
                 <w:b w:val="0"/>
                 <w:color w:val="000000"/>
-                <w:sz w:val="16"/>
+                <w:sz w:val="15"/>
               </w:rPr>
               <w:t>☒ Logrado  ☐ Parcial  ☐ No logrado</w:t>
             </w:r>
@@ -4437,9 +4437,9 @@
                 <w:rFonts w:ascii="Aptos" w:hAnsi="Aptos"/>
                 <w:b w:val="0"/>
                 <w:color w:val="000000"/>
-                <w:sz w:val="18"/>
+                <w:sz w:val="15"/>
               </w:rPr>
-              <w:t>¿El resultado coincide con los datos y el proceso?</w:t>
+              <w:t>¿El flujo completo de datos y fotografías está comprobado?</w:t>
             </w:r>
           </w:p>
         </w:tc>
@@ -4472,9 +4472,9 @@
                 <w:rFonts w:ascii="Aptos" w:hAnsi="Aptos"/>
                 <w:b w:val="0"/>
                 <w:color w:val="000000"/>
-                <w:sz w:val="16"/>
+                <w:sz w:val="15"/>
               </w:rPr>
-              <w:t>La tarjeta coincide con los datos recuperados de negocio y publicación.</w:t>
+              <w:t>Aún no está confirmado; el equipo presentará el avance y se registrarán las pruebas realizadas.</w:t>
             </w:r>
           </w:p>
         </w:tc>
@@ -4507,9 +4507,9 @@
                 <w:rFonts w:ascii="Aptos" w:hAnsi="Aptos"/>
                 <w:b w:val="0"/>
                 <w:color w:val="000000"/>
-                <w:sz w:val="16"/>
+                <w:sz w:val="15"/>
               </w:rPr>
-              <w:t>☒ Logrado  ☐ Parcial  ☐ No logrado</w:t>
+              <w:t>☐ Logrado  ☒ Parcial  ☐ No logrado</w:t>
             </w:r>
           </w:p>
         </w:tc>
@@ -4543,9 +4543,9 @@
                 <w:rFonts w:ascii="Aptos" w:hAnsi="Aptos"/>
                 <w:b w:val="0"/>
                 <w:color w:val="000000"/>
-                <w:sz w:val="18"/>
+                <w:sz w:val="15"/>
               </w:rPr>
-              <w:t>¿Qué funcionalidades acumuladas requieren ajustes?</w:t>
+              <w:t>¿Qué decisión se toma para continuar?</w:t>
             </w:r>
           </w:p>
         </w:tc>
@@ -4577,9 +4577,9 @@
                 <w:rFonts w:ascii="Aptos" w:hAnsi="Aptos"/>
                 <w:b w:val="0"/>
                 <w:color w:val="000000"/>
-                <w:sz w:val="16"/>
+                <w:sz w:val="15"/>
               </w:rPr>
-              <w:t>Ajustar presentación móvil y nombres de profesionales según el rubro del negocio.</w:t>
+              <w:t>Priorizar el listado, el perfil/portafolio y la asociación correcta de fotos; dejar otras mejoras para iteraciones posteriores.</w:t>
             </w:r>
           </w:p>
         </w:tc>
@@ -4611,9 +4611,9 @@
                 <w:rFonts w:ascii="Aptos" w:hAnsi="Aptos"/>
                 <w:b w:val="0"/>
                 <w:color w:val="000000"/>
-                <w:sz w:val="16"/>
+                <w:sz w:val="15"/>
               </w:rPr>
-              <w:t>☐ Logrado  ☒ Parcial  ☐ No logrado</w:t>
+              <w:t>☒ Logrado  ☐ Parcial  ☐ No logrado</w:t>
             </w:r>
           </w:p>
         </w:tc>
@@ -4822,7 +4822,7 @@
                 <w:color w:val="000000"/>
                 <w:sz w:val="16"/>
               </w:rPr>
-              <w:t>Aumentar el alcance del Marketplace antes de estabilizar la salida pública.</w:t>
+              <w:t>La carga de fotos y la asociación con el negocio pueden quedar incompletas para la demostración.</w:t>
             </w:r>
           </w:p>
         </w:tc>
@@ -4856,7 +4856,7 @@
                 <w:color w:val="000000"/>
                 <w:sz w:val="16"/>
               </w:rPr>
-              <w:t>Puede retrasar pruebas y afectar módulos ya operativos.</w:t>
+              <w:t>Sin ese vínculo no se comprueba el flujo completo del portafolio.</w:t>
             </w:r>
           </w:p>
         </w:tc>
@@ -4890,7 +4890,7 @@
                 <w:color w:val="000000"/>
                 <w:sz w:val="16"/>
               </w:rPr>
-              <w:t>Cerrar v1.3 con listado y perfil; dejar responsive y adaptación por rubro para v2.0.</w:t>
+              <w:t>Mostrar por separado la parte funcional y las tareas pendientes; probar que las fotos correspondan al negocio correcto.</w:t>
             </w:r>
           </w:p>
         </w:tc>
@@ -4924,7 +4924,7 @@
                 <w:color w:val="000000"/>
                 <w:sz w:val="16"/>
               </w:rPr>
-              <w:t>Equipo · 26/09</w:t>
+              <w:t>Equipo · 01/10</w:t>
             </w:r>
           </w:p>
         </w:tc>
@@ -5133,7 +5133,7 @@
                 <w:color w:val="000000"/>
                 <w:sz w:val="16"/>
               </w:rPr>
-              <w:t>Adaptar Marketplace a móvil y personalizar etiquetas por industria.</w:t>
+              <w:t>Completar el recorrido desde el listado público hasta el portafolio con fotografías asociadas al negocio.</w:t>
             </w:r>
           </w:p>
         </w:tc>
@@ -5201,7 +5201,7 @@
                 <w:color w:val="000000"/>
                 <w:sz w:val="16"/>
               </w:rPr>
-              <w:t>03/10</w:t>
+              <w:t>10/10</w:t>
             </w:r>
           </w:p>
         </w:tc>
@@ -5235,7 +5235,7 @@
                 <w:color w:val="000000"/>
                 <w:sz w:val="16"/>
               </w:rPr>
-              <w:t>Flujo usable en móvil y términos configurables para rubros como barbería y centro médico.</w:t>
+              <w:t>Desde la landing se abre un negocio y se muestran sus trabajos; verificar la carga de una foto si esa opción queda implementada.</w:t>
             </w:r>
           </w:p>
         </w:tc>
@@ -5250,9 +5250,9 @@
           <w:rFonts w:ascii="Aptos" w:hAnsi="Aptos"/>
           <w:b/>
           <w:color w:val="000000"/>
-          <w:sz w:val="21"/>
+          <w:sz w:val="16"/>
         </w:rPr>
-        <w:t>Estado general de la iteración:  ☒ Cumplida    ☐ Parcialmente cumplida    ☐ No cumplida</w:t>
+        <w:t>Estado general de la iteración:  ☐ Cumplida    ☒ Parcialmente cumplida    ☐ No cumplida</w:t>
       </w:r>
     </w:p>
     <w:p>

</xml_diff>